<commit_message>
docs: update deployment proof and technical report with live AWS infrastructure parameters
</commit_message>
<xml_diff>
--- a/deployment_proof.docx
+++ b/deployment_proof.docx
@@ -230,7 +230,7 @@
                 <w:color w:val="1E293B"/>
                 <w:sz w:val="17"/>
               </w:rPr>
-              <w:t>AWS Deployment Region</w:t>
+              <w:t>Live Web Application URL</w:t>
             </w:r>
           </w:p>
         </w:tc>
@@ -251,7 +251,7 @@
                 <w:color w:val="1E293B"/>
                 <w:sz w:val="17"/>
               </w:rPr>
-              <w:t>us-east-1 (US East - N. Virginia)</w:t>
+              <w:t>http://56.228.41.189/</w:t>
             </w:r>
           </w:p>
         </w:tc>
@@ -275,7 +275,7 @@
                 <w:color w:val="1E293B"/>
                 <w:sz w:val="17"/>
               </w:rPr>
-              <w:t>Compute Instance (EC2)</w:t>
+              <w:t>Cloud Telemetry Endpoint</w:t>
             </w:r>
           </w:p>
         </w:tc>
@@ -296,7 +296,7 @@
                 <w:color w:val="1E293B"/>
                 <w:sz w:val="17"/>
               </w:rPr>
-              <w:t>Ubuntu Server 24.04 LTS (t2.micro / t3.micro Free Tier)</w:t>
+              <w:t>http://56.228.41.189/health/</w:t>
             </w:r>
           </w:p>
         </w:tc>
@@ -320,7 +320,7 @@
                 <w:color w:val="1E293B"/>
                 <w:sz w:val="17"/>
               </w:rPr>
-              <w:t>Managed Relational DB (RDS)</w:t>
+              <w:t>AWS Deployment Region</w:t>
             </w:r>
           </w:p>
         </w:tc>
@@ -341,7 +341,7 @@
                 <w:color w:val="1E293B"/>
                 <w:sz w:val="17"/>
               </w:rPr>
-              <w:t>Amazon RDS PostgreSQL 15 (Single-AZ, db.t3.micro)</w:t>
+              <w:t>eu-north-1 (Europe - Stockholm)</w:t>
             </w:r>
           </w:p>
         </w:tc>
@@ -365,7 +365,7 @@
                 <w:color w:val="1E293B"/>
                 <w:sz w:val="17"/>
               </w:rPr>
-              <w:t>Object Storage (S3)</w:t>
+              <w:t>Compute Instance (Amazon EC2)</w:t>
             </w:r>
           </w:p>
         </w:tc>
@@ -386,7 +386,7 @@
                 <w:color w:val="1E293B"/>
                 <w:sz w:val="17"/>
               </w:rPr>
-              <w:t>campusfind-item-images-capstone (Decoupled media assets)</w:t>
+              <w:t>i-09e746740d3fa087e (Ubuntu 24.04 LTS, t4g.micro)</w:t>
             </w:r>
           </w:p>
         </w:tc>
@@ -410,7 +410,7 @@
                 <w:color w:val="1E293B"/>
                 <w:sz w:val="17"/>
               </w:rPr>
-              <w:t>Web Server / WSGI Daemon</w:t>
+              <w:t>Managed Database (Amazon RDS)</w:t>
             </w:r>
           </w:p>
         </w:tc>
@@ -431,7 +431,7 @@
                 <w:color w:val="1E293B"/>
                 <w:sz w:val="17"/>
               </w:rPr>
-              <w:t>Nginx 1.24+ (Reverse Proxy) + Gunicorn 21+ (Systemd Service)</w:t>
+              <w:t>campusfind-db.cfmc4qqmmeqe.eu-north-1.rds.amazonaws.com:5432 (PostgreSQL 15)</w:t>
             </w:r>
           </w:p>
         </w:tc>
@@ -455,7 +455,7 @@
                 <w:color w:val="1E293B"/>
                 <w:sz w:val="17"/>
               </w:rPr>
-              <w:t>Health &amp; Monitoring</w:t>
+              <w:t>Object Storage (Amazon S3)</w:t>
             </w:r>
           </w:p>
         </w:tc>
@@ -476,7 +476,187 @@
                 <w:color w:val="1E293B"/>
                 <w:sz w:val="17"/>
               </w:rPr>
-              <w:t>/health/ JSON Telemetry + Amazon CloudWatch CPU/Network Alarms</w:t>
+              <w:t>campusfind-item-images-444158822918 (Decoupled S3 bucket)</w:t>
+            </w:r>
+          </w:p>
+        </w:tc>
+      </w:tr>
+      <w:tr>
+        <w:tc>
+          <w:tcPr>
+            <w:tcW w:type="dxa" w:w="4680"/>
+            <w:shd w:fill="FFFFFF"/>
+            <w:tcMar>
+              <w:top w:w="70" w:type="dxa"/>
+              <w:bottom w:w="70" w:type="dxa"/>
+              <w:left w:w="90" w:type="dxa"/>
+              <w:right w:w="90" w:type="dxa"/>
+            </w:tcMar>
+          </w:tcPr>
+          <w:p>
+            <w:r>
+              <w:rPr>
+                <w:b/>
+                <w:color w:val="1E293B"/>
+                <w:sz w:val="17"/>
+              </w:rPr>
+              <w:t>IAM Access Management</w:t>
+            </w:r>
+          </w:p>
+        </w:tc>
+        <w:tc>
+          <w:tcPr>
+            <w:tcW w:type="dxa" w:w="4680"/>
+            <w:shd w:fill="FFFFFF"/>
+            <w:tcMar>
+              <w:top w:w="70" w:type="dxa"/>
+              <w:bottom w:w="70" w:type="dxa"/>
+              <w:left w:w="90" w:type="dxa"/>
+              <w:right w:w="90" w:type="dxa"/>
+            </w:tcMar>
+          </w:tcPr>
+          <w:p>
+            <w:r>
+              <w:rPr>
+                <w:color w:val="1E293B"/>
+                <w:sz w:val="17"/>
+              </w:rPr>
+              <w:t>campusfind-s3-user (Least-privilege S3 CRUD policy)</w:t>
+            </w:r>
+          </w:p>
+        </w:tc>
+      </w:tr>
+      <w:tr>
+        <w:tc>
+          <w:tcPr>
+            <w:tcW w:type="dxa" w:w="4680"/>
+            <w:shd w:fill="F8FAFC"/>
+            <w:tcMar>
+              <w:top w:w="70" w:type="dxa"/>
+              <w:bottom w:w="70" w:type="dxa"/>
+              <w:left w:w="90" w:type="dxa"/>
+              <w:right w:w="90" w:type="dxa"/>
+            </w:tcMar>
+          </w:tcPr>
+          <w:p>
+            <w:r>
+              <w:rPr>
+                <w:b/>
+                <w:color w:val="1E293B"/>
+                <w:sz w:val="17"/>
+              </w:rPr>
+              <w:t>Security Groups</w:t>
+            </w:r>
+          </w:p>
+        </w:tc>
+        <w:tc>
+          <w:tcPr>
+            <w:tcW w:type="dxa" w:w="4680"/>
+            <w:shd w:fill="F8FAFC"/>
+            <w:tcMar>
+              <w:top w:w="70" w:type="dxa"/>
+              <w:bottom w:w="70" w:type="dxa"/>
+              <w:left w:w="90" w:type="dxa"/>
+              <w:right w:w="90" w:type="dxa"/>
+            </w:tcMar>
+          </w:tcPr>
+          <w:p>
+            <w:r>
+              <w:rPr>
+                <w:color w:val="1E293B"/>
+                <w:sz w:val="17"/>
+              </w:rPr>
+              <w:t>EC2-SG: sg-0a5bfe64068a5c6d0 | RDS-SG: sg-05d0947a3de6e234e</w:t>
+            </w:r>
+          </w:p>
+        </w:tc>
+      </w:tr>
+      <w:tr>
+        <w:tc>
+          <w:tcPr>
+            <w:tcW w:type="dxa" w:w="4680"/>
+            <w:shd w:fill="FFFFFF"/>
+            <w:tcMar>
+              <w:top w:w="70" w:type="dxa"/>
+              <w:bottom w:w="70" w:type="dxa"/>
+              <w:left w:w="90" w:type="dxa"/>
+              <w:right w:w="90" w:type="dxa"/>
+            </w:tcMar>
+          </w:tcPr>
+          <w:p>
+            <w:r>
+              <w:rPr>
+                <w:b/>
+                <w:color w:val="1E293B"/>
+                <w:sz w:val="17"/>
+              </w:rPr>
+              <w:t>Web Server &amp; WSGI Daemon</w:t>
+            </w:r>
+          </w:p>
+        </w:tc>
+        <w:tc>
+          <w:tcPr>
+            <w:tcW w:type="dxa" w:w="4680"/>
+            <w:shd w:fill="FFFFFF"/>
+            <w:tcMar>
+              <w:top w:w="70" w:type="dxa"/>
+              <w:bottom w:w="70" w:type="dxa"/>
+              <w:left w:w="90" w:type="dxa"/>
+              <w:right w:w="90" w:type="dxa"/>
+            </w:tcMar>
+          </w:tcPr>
+          <w:p>
+            <w:r>
+              <w:rPr>
+                <w:color w:val="1E293B"/>
+                <w:sz w:val="17"/>
+              </w:rPr>
+              <w:t>Nginx 1.24+ (Reverse Proxy) + Gunicorn 26+ (Systemd daemon)</w:t>
+            </w:r>
+          </w:p>
+        </w:tc>
+      </w:tr>
+      <w:tr>
+        <w:tc>
+          <w:tcPr>
+            <w:tcW w:type="dxa" w:w="4680"/>
+            <w:shd w:fill="F8FAFC"/>
+            <w:tcMar>
+              <w:top w:w="70" w:type="dxa"/>
+              <w:bottom w:w="70" w:type="dxa"/>
+              <w:left w:w="90" w:type="dxa"/>
+              <w:right w:w="90" w:type="dxa"/>
+            </w:tcMar>
+          </w:tcPr>
+          <w:p>
+            <w:r>
+              <w:rPr>
+                <w:b/>
+                <w:color w:val="1E293B"/>
+                <w:sz w:val="17"/>
+              </w:rPr>
+              <w:t>Automated Testing Validation</w:t>
+            </w:r>
+          </w:p>
+        </w:tc>
+        <w:tc>
+          <w:tcPr>
+            <w:tcW w:type="dxa" w:w="4680"/>
+            <w:shd w:fill="F8FAFC"/>
+            <w:tcMar>
+              <w:top w:w="70" w:type="dxa"/>
+              <w:bottom w:w="70" w:type="dxa"/>
+              <w:left w:w="90" w:type="dxa"/>
+              <w:right w:w="90" w:type="dxa"/>
+            </w:tcMar>
+          </w:tcPr>
+          <w:p>
+            <w:r>
+              <w:rPr>
+                <w:color w:val="1E293B"/>
+                <w:sz w:val="17"/>
+              </w:rPr>
+              <w:t>15/15 Automated Unit &amp; Integration Tests Passed (100% OK)</w:t>
             </w:r>
           </w:p>
         </w:tc>

</xml_diff>